<commit_message>
Update Learning Publisher workflow and documentation
</commit_message>
<xml_diff>
--- a/imports/courses/outbreak_ve_demo/docx/02_measures_and_data.docx
+++ b/imports/courses/outbreak_ve_demo/docx/02_measures_and_data.docx
@@ -51,24 +51,13 @@
         </w:rPr>
       </w:pPr>
       <w:r>
-        <w:rPr>
-          <w:rFonts w:ascii="Calibri" w:hAnsi="Calibri" w:cs="Calibri"/>
-        </w:rPr>
-        <w:br/>
-      </w:r>
-      <w:proofErr w:type="gramStart"/>
-      <w:r>
-        <w:rPr>
-          <w:rFonts w:ascii="Calibri" w:hAnsi="Calibri" w:cs="Calibri"/>
-        </w:rPr>
-        <w:t>Text :</w:t>
-      </w:r>
-      <w:proofErr w:type="gramEnd"/>
-      <w:r>
-        <w:rPr>
-          <w:rFonts w:ascii="Calibri" w:hAnsi="Calibri" w:cs="Calibri"/>
-        </w:rPr>
-        <w:t>: Vaccine effectiveness measures the reduction in disease risk among vaccinated individuals compared to unvaccinated individuals in real-world conditions.</w:t>
+        <w:t>Vaccine effectiveness measures the reduction in disease risk among vaccinated individuals compared to unvaccinated individuals in real-world conditions.</w:t>
+      </w:r>
+    </w:p>
+    <w:p>
+      <w:pPr/>
+      <w:r>
+        <w:t>END Callout</w:t>
       </w:r>
     </w:p>
     <w:p>
@@ -120,94 +109,63 @@
         </w:rPr>
       </w:pPr>
       <w:r>
-        <w:rPr>
-          <w:rFonts w:ascii="Calibri" w:hAnsi="Calibri" w:cs="Calibri"/>
-        </w:rPr>
         <w:t>Reveal</w:t>
       </w:r>
-      <w:r>
-        <w:rPr>
-          <w:rFonts w:ascii="Calibri" w:hAnsi="Calibri" w:cs="Calibri"/>
-        </w:rPr>
-        <w:br/>
-        <w:t xml:space="preserve">Step </w:t>
-      </w:r>
-      <w:proofErr w:type="gramStart"/>
-      <w:r>
-        <w:rPr>
-          <w:rFonts w:ascii="Calibri" w:hAnsi="Calibri" w:cs="Calibri"/>
-        </w:rPr>
-        <w:t>1 :</w:t>
-      </w:r>
-      <w:proofErr w:type="gramEnd"/>
-      <w:r>
-        <w:rPr>
-          <w:rFonts w:ascii="Calibri" w:hAnsi="Calibri" w:cs="Calibri"/>
-        </w:rPr>
-        <w:t>: Calculate risk in the vaccinated group: 5 / 500 = 0.01</w:t>
-      </w:r>
-      <w:r>
-        <w:rPr>
-          <w:rFonts w:ascii="Calibri" w:hAnsi="Calibri" w:cs="Calibri"/>
-        </w:rPr>
-        <w:br/>
-        <w:t xml:space="preserve">Step </w:t>
-      </w:r>
-      <w:proofErr w:type="gramStart"/>
-      <w:r>
-        <w:rPr>
-          <w:rFonts w:ascii="Calibri" w:hAnsi="Calibri" w:cs="Calibri"/>
-        </w:rPr>
-        <w:t>2 :</w:t>
-      </w:r>
-      <w:proofErr w:type="gramEnd"/>
-      <w:r>
-        <w:rPr>
-          <w:rFonts w:ascii="Calibri" w:hAnsi="Calibri" w:cs="Calibri"/>
-        </w:rPr>
-        <w:t>: Calculate risk in the unvaccinated group: 25 / 500 = 0.05</w:t>
-      </w:r>
-      <w:r>
-        <w:rPr>
-          <w:rFonts w:ascii="Calibri" w:hAnsi="Calibri" w:cs="Calibri"/>
-        </w:rPr>
-        <w:br/>
-        <w:t xml:space="preserve">Step </w:t>
-      </w:r>
-      <w:proofErr w:type="gramStart"/>
-      <w:r>
-        <w:rPr>
-          <w:rFonts w:ascii="Calibri" w:hAnsi="Calibri" w:cs="Calibri"/>
-        </w:rPr>
-        <w:t>3 :</w:t>
-      </w:r>
-      <w:proofErr w:type="gramEnd"/>
-      <w:r>
-        <w:rPr>
-          <w:rFonts w:ascii="Calibri" w:hAnsi="Calibri" w:cs="Calibri"/>
-        </w:rPr>
-        <w:t>: Relative Risk = 0.01 / 0.05 = 0.2</w:t>
-      </w:r>
-      <w:r>
-        <w:rPr>
-          <w:rFonts w:ascii="Calibri" w:hAnsi="Calibri" w:cs="Calibri"/>
-        </w:rPr>
-        <w:br/>
-        <w:t xml:space="preserve">Step </w:t>
-      </w:r>
-      <w:proofErr w:type="gramStart"/>
-      <w:r>
-        <w:rPr>
-          <w:rFonts w:ascii="Calibri" w:hAnsi="Calibri" w:cs="Calibri"/>
-        </w:rPr>
-        <w:t>4 :</w:t>
-      </w:r>
-      <w:proofErr w:type="gramEnd"/>
-      <w:r>
-        <w:rPr>
-          <w:rFonts w:ascii="Calibri" w:hAnsi="Calibri" w:cs="Calibri"/>
-        </w:rPr>
-        <w:t>: VE = (1 − 0.2) × 100 = 80%</w:t>
+    </w:p>
+    <w:p>
+      <w:pPr/>
+      <w:r>
+        <w:t>Label :: Show calculation</w:t>
+      </w:r>
+    </w:p>
+    <w:p>
+      <w:pPr>
+        <w:numPr>
+          <w:ilvl w:val="0"/>
+          <w:numId w:val="7"/>
+        </w:numPr>
+      </w:pPr>
+      <w:r>
+        <w:t>Calculate risk in the vaccinated group: 5 / 500 = 0.01</w:t>
+      </w:r>
+    </w:p>
+    <w:p>
+      <w:pPr>
+        <w:numPr>
+          <w:ilvl w:val="0"/>
+          <w:numId w:val="7"/>
+        </w:numPr>
+      </w:pPr>
+      <w:r>
+        <w:t>Calculate risk in the unvaccinated group: 25 / 500 = 0.05</w:t>
+      </w:r>
+    </w:p>
+    <w:p>
+      <w:pPr>
+        <w:numPr>
+          <w:ilvl w:val="0"/>
+          <w:numId w:val="7"/>
+        </w:numPr>
+      </w:pPr>
+      <w:r>
+        <w:t>Relative Risk = 0.01 / 0.05 = 0.2</w:t>
+      </w:r>
+    </w:p>
+    <w:p>
+      <w:pPr>
+        <w:numPr>
+          <w:ilvl w:val="0"/>
+          <w:numId w:val="7"/>
+        </w:numPr>
+      </w:pPr>
+      <w:r>
+        <w:t>VE = (1 − 0.2) × 100 = 80%</w:t>
+      </w:r>
+    </w:p>
+    <w:p>
+      <w:pPr/>
+      <w:r>
+        <w:t>END Reveal</w:t>
       </w:r>
     </w:p>
     <w:p>
@@ -244,53 +202,26 @@
           <w:rFonts w:ascii="Calibri" w:hAnsi="Calibri" w:cs="Calibri"/>
         </w:rPr>
       </w:pPr>
-      <w:proofErr w:type="spellStart"/>
-      <w:r>
-        <w:rPr>
-          <w:rFonts w:ascii="Calibri" w:hAnsi="Calibri" w:cs="Calibri"/>
-        </w:rPr>
+      <w:r>
         <w:t>SelfCheck</w:t>
       </w:r>
-      <w:proofErr w:type="spellEnd"/>
-      <w:r>
-        <w:rPr>
-          <w:rFonts w:ascii="Calibri" w:hAnsi="Calibri" w:cs="Calibri"/>
-        </w:rPr>
-        <w:br/>
-      </w:r>
-      <w:proofErr w:type="gramStart"/>
-      <w:r>
-        <w:rPr>
-          <w:rFonts w:ascii="Calibri" w:hAnsi="Calibri" w:cs="Calibri"/>
-        </w:rPr>
-        <w:t>Question :</w:t>
-      </w:r>
-      <w:proofErr w:type="gramEnd"/>
-      <w:r>
-        <w:rPr>
-          <w:rFonts w:ascii="Calibri" w:hAnsi="Calibri" w:cs="Calibri"/>
-        </w:rPr>
-        <w:t>: Why might vaccine effectiveness differ between populations?</w:t>
-      </w:r>
-      <w:r>
-        <w:rPr>
-          <w:rFonts w:ascii="Calibri" w:hAnsi="Calibri" w:cs="Calibri"/>
-        </w:rPr>
-        <w:br/>
-      </w:r>
-      <w:proofErr w:type="gramStart"/>
-      <w:r>
-        <w:rPr>
-          <w:rFonts w:ascii="Calibri" w:hAnsi="Calibri" w:cs="Calibri"/>
-        </w:rPr>
-        <w:t>Answer :</w:t>
-      </w:r>
-      <w:proofErr w:type="gramEnd"/>
-      <w:r>
-        <w:rPr>
-          <w:rFonts w:ascii="Calibri" w:hAnsi="Calibri" w:cs="Calibri"/>
-        </w:rPr>
-        <w:t>: Differences in exposure, population structure, healthcare access, and underlying health conditions can influence estimates.</w:t>
+    </w:p>
+    <w:p>
+      <w:pPr/>
+      <w:r>
+        <w:t>Question :: Why might vaccine effectiveness differ between populations?</w:t>
+      </w:r>
+    </w:p>
+    <w:p>
+      <w:pPr/>
+      <w:r>
+        <w:t>Answer :: Differences in exposure, population structure, healthcare access, and underlying health conditions can influence estimates.</w:t>
+      </w:r>
+    </w:p>
+    <w:p>
+      <w:pPr/>
+      <w:r>
+        <w:t>END SelfCheck</w:t>
       </w:r>
     </w:p>
     <w:p>
@@ -2425,70 +2356,67 @@
         </w:rPr>
       </w:pPr>
       <w:r>
-        <w:rPr>
-          <w:rFonts w:ascii="Calibri" w:hAnsi="Calibri" w:cs="Calibri"/>
-        </w:rPr>
         <w:t>Tabs</w:t>
       </w:r>
-      <w:r>
-        <w:rPr>
-          <w:rFonts w:ascii="Calibri" w:hAnsi="Calibri" w:cs="Calibri"/>
-        </w:rPr>
-        <w:br/>
-      </w:r>
-      <w:proofErr w:type="gramStart"/>
-      <w:r>
-        <w:rPr>
-          <w:rFonts w:ascii="Calibri" w:hAnsi="Calibri" w:cs="Calibri"/>
-        </w:rPr>
-        <w:t>Interpretation :</w:t>
-      </w:r>
-      <w:proofErr w:type="gramEnd"/>
-      <w:r>
-        <w:rPr>
-          <w:rFonts w:ascii="Calibri" w:hAnsi="Calibri" w:cs="Calibri"/>
-        </w:rPr>
-        <w:t>: An 80% vaccine effectiveness means vaccinated individuals have substantially lower risk compared to unvaccinated individuals.</w:t>
-      </w:r>
-      <w:r>
-        <w:rPr>
-          <w:rFonts w:ascii="Calibri" w:hAnsi="Calibri" w:cs="Calibri"/>
-        </w:rPr>
-        <w:br/>
-      </w:r>
-      <w:proofErr w:type="gramStart"/>
-      <w:r>
-        <w:rPr>
-          <w:rFonts w:ascii="Calibri" w:hAnsi="Calibri" w:cs="Calibri"/>
-        </w:rPr>
-        <w:t>Assumptions :</w:t>
-      </w:r>
-      <w:proofErr w:type="gramEnd"/>
-      <w:r>
-        <w:rPr>
-          <w:rFonts w:ascii="Calibri" w:hAnsi="Calibri" w:cs="Calibri"/>
-        </w:rPr>
-        <w:t>: The calculation assumes both groups are comparable and equally exposed.</w:t>
-      </w:r>
-      <w:r>
-        <w:rPr>
-          <w:rFonts w:ascii="Calibri" w:hAnsi="Calibri" w:cs="Calibri"/>
-        </w:rPr>
-        <w:br/>
-      </w:r>
-      <w:proofErr w:type="gramStart"/>
-      <w:r>
-        <w:rPr>
-          <w:rFonts w:ascii="Calibri" w:hAnsi="Calibri" w:cs="Calibri"/>
-        </w:rPr>
-        <w:t>Limitations :</w:t>
-      </w:r>
-      <w:proofErr w:type="gramEnd"/>
-      <w:r>
-        <w:rPr>
-          <w:rFonts w:ascii="Calibri" w:hAnsi="Calibri" w:cs="Calibri"/>
-        </w:rPr>
-        <w:t>: Confounding factors such as age, immunity, or healthcare access may influence results.</w:t>
+    </w:p>
+    <w:p>
+      <w:pPr/>
+      <w:r>
+        <w:t>Tab :: Interpretation</w:t>
+      </w:r>
+    </w:p>
+    <w:p>
+      <w:pPr/>
+      <w:r>
+        <w:t>An 80% vaccine effectiveness means vaccinated individuals have substantially lower risk compared to unvaccinated individuals.</w:t>
+      </w:r>
+    </w:p>
+    <w:p>
+      <w:pPr/>
+      <w:r>
+        <w:t>END Tab</w:t>
+      </w:r>
+    </w:p>
+    <w:p>
+      <w:pPr/>
+      <w:r>
+        <w:t>Tab :: Assumptions</w:t>
+      </w:r>
+    </w:p>
+    <w:p>
+      <w:pPr/>
+      <w:r>
+        <w:t>The calculation assumes both groups are comparable and equally exposed.</w:t>
+      </w:r>
+    </w:p>
+    <w:p>
+      <w:pPr/>
+      <w:r>
+        <w:t>END Tab</w:t>
+      </w:r>
+    </w:p>
+    <w:p>
+      <w:pPr/>
+      <w:r>
+        <w:t>Tab :: Limitations</w:t>
+      </w:r>
+    </w:p>
+    <w:p>
+      <w:pPr/>
+      <w:r>
+        <w:t>Confounding factors such as age, immunity, or healthcare access may influence results.</w:t>
+      </w:r>
+    </w:p>
+    <w:p>
+      <w:pPr/>
+      <w:r>
+        <w:t>END Tab</w:t>
+      </w:r>
+    </w:p>
+    <w:p>
+      <w:pPr/>
+      <w:r>
+        <w:t>END Tabs</w:t>
       </w:r>
     </w:p>
     <w:p>
@@ -2525,79 +2453,32 @@
           <w:rFonts w:ascii="Calibri" w:hAnsi="Calibri" w:cs="Calibri"/>
         </w:rPr>
       </w:pPr>
-      <w:proofErr w:type="gramStart"/>
-      <w:r>
-        <w:rPr>
-          <w:rFonts w:ascii="Calibri" w:hAnsi="Calibri" w:cs="Calibri"/>
-        </w:rPr>
-        <w:t>Image :</w:t>
-      </w:r>
-      <w:proofErr w:type="gramEnd"/>
-      <w:r>
-        <w:rPr>
-          <w:rFonts w:ascii="Calibri" w:hAnsi="Calibri" w:cs="Calibri"/>
-        </w:rPr>
-        <w:t>: resources/images/epidemic-curve.png</w:t>
-      </w:r>
-      <w:r>
-        <w:rPr>
-          <w:rFonts w:ascii="Calibri" w:hAnsi="Calibri" w:cs="Calibri"/>
-        </w:rPr>
-        <w:br/>
-      </w:r>
-      <w:proofErr w:type="gramStart"/>
-      <w:r>
-        <w:rPr>
-          <w:rFonts w:ascii="Calibri" w:hAnsi="Calibri" w:cs="Calibri"/>
-        </w:rPr>
-        <w:t>Alt :</w:t>
-      </w:r>
-      <w:proofErr w:type="gramEnd"/>
-      <w:r>
-        <w:rPr>
-          <w:rFonts w:ascii="Calibri" w:hAnsi="Calibri" w:cs="Calibri"/>
-        </w:rPr>
-        <w:t>: Epidemic curve showing number of measles cases over time by vaccination status</w:t>
-      </w:r>
-      <w:r>
-        <w:rPr>
-          <w:rFonts w:ascii="Calibri" w:hAnsi="Calibri" w:cs="Calibri"/>
-        </w:rPr>
-        <w:br/>
-      </w:r>
-      <w:proofErr w:type="gramStart"/>
-      <w:r>
-        <w:rPr>
-          <w:rFonts w:ascii="Calibri" w:hAnsi="Calibri" w:cs="Calibri"/>
-        </w:rPr>
-        <w:t>Caption :</w:t>
-      </w:r>
-      <w:proofErr w:type="gramEnd"/>
-      <w:r>
-        <w:rPr>
-          <w:rFonts w:ascii="Calibri" w:hAnsi="Calibri" w:cs="Calibri"/>
-        </w:rPr>
-        <w:t>: Epidemic curve comparing vaccinated and unvaccinated groups.</w:t>
-      </w:r>
-      <w:r>
-        <w:rPr>
-          <w:rFonts w:ascii="Calibri" w:hAnsi="Calibri" w:cs="Calibri"/>
-        </w:rPr>
-        <w:br/>
-      </w:r>
-      <w:proofErr w:type="gramStart"/>
-      <w:r>
-        <w:rPr>
-          <w:rFonts w:ascii="Calibri" w:hAnsi="Calibri" w:cs="Calibri"/>
-        </w:rPr>
-        <w:t>Width :</w:t>
-      </w:r>
-      <w:proofErr w:type="gramEnd"/>
-      <w:r>
-        <w:rPr>
-          <w:rFonts w:ascii="Calibri" w:hAnsi="Calibri" w:cs="Calibri"/>
-        </w:rPr>
-        <w:t>: 70%</w:t>
+      <w:r>
+        <w:t>Image :: resources/images/epidemic-curve.png</w:t>
+      </w:r>
+    </w:p>
+    <w:p>
+      <w:pPr/>
+      <w:r>
+        <w:t>Alt :: Epidemic curve showing number of measles cases over time by vaccination status</w:t>
+      </w:r>
+    </w:p>
+    <w:p>
+      <w:pPr/>
+      <w:r>
+        <w:t>Caption :: Epidemic curve comparing vaccinated and unvaccinated groups.</w:t>
+      </w:r>
+    </w:p>
+    <w:p>
+      <w:pPr/>
+      <w:r>
+        <w:t>Width :: 70%</w:t>
+      </w:r>
+    </w:p>
+    <w:p>
+      <w:pPr/>
+      <w:r>
+        <w:t>END Image</w:t>
       </w:r>
     </w:p>
     <w:p>
@@ -2646,67 +2527,264 @@
           <w:rFonts w:ascii="Calibri" w:hAnsi="Calibri" w:cs="Calibri"/>
         </w:rPr>
       </w:pPr>
+      <w:r>
+        <w:t>File :: resources/pdf/outbreak-report.pdf</w:t>
+      </w:r>
+    </w:p>
+    <w:p>
+      <w:pPr/>
+      <w:r>
+        <w:t>Display :: embed</w:t>
+      </w:r>
+    </w:p>
+    <w:p>
+      <w:pPr/>
+      <w:r>
+        <w:t>Label :: View full outbreak investigation report</w:t>
+      </w:r>
+    </w:p>
+    <w:p>
+      <w:pPr/>
+      <w:r>
+        <w:t>END File</w:t>
+      </w:r>
+    </w:p>
+    <w:p>
+      <w:pPr>
+        <w:rPr>
+          <w:rFonts w:ascii="Calibri" w:hAnsi="Calibri" w:cs="Calibri"/>
+        </w:rPr>
+      </w:pPr>
+    </w:p>
+    <w:p>
+      <w:pPr>
+        <w:pStyle w:val="Heading2"/>
+        <w:rPr>
+          <w:rFonts w:ascii="Calibri" w:hAnsi="Calibri" w:cs="Calibri"/>
+        </w:rPr>
+      </w:pPr>
+      <w:r>
+        <w:rPr>
+          <w:rFonts w:ascii="Calibri" w:hAnsi="Calibri" w:cs="Calibri"/>
+        </w:rPr>
+        <w:t>Download Dataset</w:t>
+      </w:r>
+    </w:p>
+    <w:p>
+      <w:pPr>
+        <w:rPr>
+          <w:rFonts w:ascii="Calibri" w:hAnsi="Calibri" w:cs="Calibri"/>
+        </w:rPr>
+      </w:pPr>
+    </w:p>
+    <w:p>
+      <w:pPr>
+        <w:rPr>
+          <w:rFonts w:ascii="Calibri" w:hAnsi="Calibri" w:cs="Calibri"/>
+        </w:rPr>
+      </w:pPr>
+      <w:r>
+        <w:t>File :: resources/data/outbreak-dataset.zip</w:t>
+      </w:r>
+    </w:p>
+    <w:p>
+      <w:pPr/>
+      <w:r>
+        <w:t>Label :: Download full dataset</w:t>
+      </w:r>
+    </w:p>
+    <w:p>
+      <w:pPr/>
+      <w:r>
+        <w:t>END File</w:t>
+      </w:r>
+    </w:p>
+    <w:p>
+      <w:pPr>
+        <w:rPr>
+          <w:rFonts w:ascii="Calibri" w:hAnsi="Calibri" w:cs="Calibri"/>
+        </w:rPr>
+      </w:pPr>
+    </w:p>
+    <w:p>
+      <w:pPr>
+        <w:rPr>
+          <w:rFonts w:ascii="Calibri" w:hAnsi="Calibri" w:cs="Calibri"/>
+        </w:rPr>
+      </w:pPr>
+    </w:p>
+    <w:p>
+      <w:pPr>
+        <w:pStyle w:val="Heading2"/>
+        <w:rPr>
+          <w:rFonts w:ascii="Calibri" w:hAnsi="Calibri" w:cs="Calibri"/>
+        </w:rPr>
+      </w:pPr>
+      <w:r>
+        <w:rPr>
+          <w:rFonts w:ascii="Calibri" w:hAnsi="Calibri" w:cs="Calibri"/>
+        </w:rPr>
+        <w:t>Quiz</w:t>
+      </w:r>
+    </w:p>
+    <w:p>
+      <w:pPr>
+        <w:rPr>
+          <w:rFonts w:ascii="Calibri" w:hAnsi="Calibri" w:cs="Calibri"/>
+        </w:rPr>
+      </w:pPr>
+      <w:r>
+        <w:rPr>
+          <w:rFonts w:ascii="Calibri" w:hAnsi="Calibri" w:cs="Calibri"/>
+        </w:rPr>
+        <w:br/>
+      </w:r>
       <w:proofErr w:type="gramStart"/>
       <w:r>
         <w:rPr>
           <w:rFonts w:ascii="Calibri" w:hAnsi="Calibri" w:cs="Calibri"/>
         </w:rPr>
-        <w:t>File :</w:t>
+        <w:t>Question :</w:t>
       </w:r>
       <w:proofErr w:type="gramEnd"/>
       <w:r>
         <w:rPr>
           <w:rFonts w:ascii="Calibri" w:hAnsi="Calibri" w:cs="Calibri"/>
         </w:rPr>
-        <w:t>: resources/pdf/outbreak-report.pdf</w:t>
-      </w:r>
-      <w:r>
-        <w:rPr>
-          <w:rFonts w:ascii="Calibri" w:hAnsi="Calibri" w:cs="Calibri"/>
-        </w:rPr>
-        <w:br/>
-      </w:r>
+        <w:t>: Based on the outbreak data, what does a vaccine effectiveness of 80% mean in practice?</w:t>
+      </w:r>
+    </w:p>
+    <w:p>
+      <w:pPr>
+        <w:rPr>
+          <w:rFonts w:ascii="Calibri" w:hAnsi="Calibri" w:cs="Calibri"/>
+        </w:rPr>
+      </w:pPr>
       <w:proofErr w:type="gramStart"/>
       <w:r>
         <w:rPr>
           <w:rFonts w:ascii="Calibri" w:hAnsi="Calibri" w:cs="Calibri"/>
         </w:rPr>
-        <w:t>Display :</w:t>
+        <w:t>Option :</w:t>
       </w:r>
       <w:proofErr w:type="gramEnd"/>
       <w:r>
         <w:rPr>
           <w:rFonts w:ascii="Calibri" w:hAnsi="Calibri" w:cs="Calibri"/>
         </w:rPr>
-        <w:t>: embed</w:t>
-      </w:r>
-      <w:r>
-        <w:rPr>
-          <w:rFonts w:ascii="Calibri" w:hAnsi="Calibri" w:cs="Calibri"/>
-        </w:rPr>
-        <w:br/>
-      </w:r>
+        <w:t>: Vaccinated individuals have zero risk of infection</w:t>
+      </w:r>
+    </w:p>
+    <w:p>
+      <w:pPr>
+        <w:rPr>
+          <w:rFonts w:ascii="Calibri" w:hAnsi="Calibri" w:cs="Calibri"/>
+        </w:rPr>
+      </w:pPr>
       <w:proofErr w:type="gramStart"/>
       <w:r>
         <w:rPr>
           <w:rFonts w:ascii="Calibri" w:hAnsi="Calibri" w:cs="Calibri"/>
         </w:rPr>
-        <w:t>Label :</w:t>
+        <w:t>Option :</w:t>
       </w:r>
       <w:proofErr w:type="gramEnd"/>
       <w:r>
         <w:rPr>
           <w:rFonts w:ascii="Calibri" w:hAnsi="Calibri" w:cs="Calibri"/>
         </w:rPr>
-        <w:t>: View full outbreak investigation report</w:t>
-      </w:r>
-    </w:p>
-    <w:p>
-      <w:pPr>
-        <w:rPr>
-          <w:rFonts w:ascii="Calibri" w:hAnsi="Calibri" w:cs="Calibri"/>
-        </w:rPr>
-      </w:pPr>
+        <w:t>: Vaccinated individuals have an 80% lower risk of infection than unvaccinated individuals</w:t>
+      </w:r>
+    </w:p>
+    <w:p>
+      <w:pPr>
+        <w:rPr>
+          <w:rFonts w:ascii="Calibri" w:hAnsi="Calibri" w:cs="Calibri"/>
+        </w:rPr>
+      </w:pPr>
+      <w:proofErr w:type="gramStart"/>
+      <w:r>
+        <w:rPr>
+          <w:rFonts w:ascii="Calibri" w:hAnsi="Calibri" w:cs="Calibri"/>
+        </w:rPr>
+        <w:t>Option :</w:t>
+      </w:r>
+      <w:proofErr w:type="gramEnd"/>
+      <w:r>
+        <w:rPr>
+          <w:rFonts w:ascii="Calibri" w:hAnsi="Calibri" w:cs="Calibri"/>
+        </w:rPr>
+        <w:t>: 80% of vaccinated individuals will not become infected</w:t>
+      </w:r>
+    </w:p>
+    <w:p>
+      <w:pPr>
+        <w:rPr>
+          <w:rFonts w:ascii="Calibri" w:hAnsi="Calibri" w:cs="Calibri"/>
+        </w:rPr>
+      </w:pPr>
+      <w:proofErr w:type="gramStart"/>
+      <w:r>
+        <w:rPr>
+          <w:rFonts w:ascii="Calibri" w:hAnsi="Calibri" w:cs="Calibri"/>
+        </w:rPr>
+        <w:t>Option :</w:t>
+      </w:r>
+      <w:proofErr w:type="gramEnd"/>
+      <w:r>
+        <w:rPr>
+          <w:rFonts w:ascii="Calibri" w:hAnsi="Calibri" w:cs="Calibri"/>
+        </w:rPr>
+        <w:t>: The vaccine prevents 80 cases in every outbreak regardless of context</w:t>
+      </w:r>
+    </w:p>
+    <w:p>
+      <w:pPr>
+        <w:rPr>
+          <w:rFonts w:ascii="Calibri" w:hAnsi="Calibri" w:cs="Calibri"/>
+        </w:rPr>
+      </w:pPr>
+      <w:proofErr w:type="gramStart"/>
+      <w:r>
+        <w:rPr>
+          <w:rFonts w:ascii="Calibri" w:hAnsi="Calibri" w:cs="Calibri"/>
+        </w:rPr>
+        <w:t>Answer :</w:t>
+      </w:r>
+      <w:proofErr w:type="gramEnd"/>
+      <w:r>
+        <w:rPr>
+          <w:rFonts w:ascii="Calibri" w:hAnsi="Calibri" w:cs="Calibri"/>
+        </w:rPr>
+        <w:t>: Vaccinated individuals have an 80% lower risk of infection than unvaccinated individuals</w:t>
+      </w:r>
+    </w:p>
+    <w:p>
+      <w:pPr>
+        <w:rPr>
+          <w:rFonts w:ascii="Calibri" w:hAnsi="Calibri" w:cs="Calibri"/>
+        </w:rPr>
+      </w:pPr>
+      <w:proofErr w:type="gramStart"/>
+      <w:r>
+        <w:rPr>
+          <w:rFonts w:ascii="Calibri" w:hAnsi="Calibri" w:cs="Calibri"/>
+        </w:rPr>
+        <w:t>Explanation :</w:t>
+      </w:r>
+      <w:proofErr w:type="gramEnd"/>
+      <w:r>
+        <w:rPr>
+          <w:rFonts w:ascii="Calibri" w:hAnsi="Calibri" w:cs="Calibri"/>
+        </w:rPr>
+        <w:t>: Vaccine effectiveness compares the risk of disease in vaccinated and unvaccinated groups under real-world conditions. An 80% VE means the vaccinated group experienced substantially lower risk, not that infection risk was eliminated entirely.</w:t>
+      </w:r>
+    </w:p>
+    <w:p>
+      <w:pPr/>
+      <w:r>
+        <w:t>END Quiz</w:t>
+      </w:r>
     </w:p>
     <w:p>
       <w:pPr>
@@ -2715,74 +2793,6 @@
           <w:rFonts w:ascii="Calibri" w:hAnsi="Calibri" w:cs="Calibri"/>
         </w:rPr>
       </w:pPr>
-      <w:r>
-        <w:rPr>
-          <w:rFonts w:ascii="Calibri" w:hAnsi="Calibri" w:cs="Calibri"/>
-        </w:rPr>
-        <w:t>Download Dataset</w:t>
-      </w:r>
-    </w:p>
-    <w:p>
-      <w:pPr>
-        <w:rPr>
-          <w:rFonts w:ascii="Calibri" w:hAnsi="Calibri" w:cs="Calibri"/>
-        </w:rPr>
-      </w:pPr>
-    </w:p>
-    <w:p>
-      <w:pPr>
-        <w:rPr>
-          <w:rFonts w:ascii="Calibri" w:hAnsi="Calibri" w:cs="Calibri"/>
-        </w:rPr>
-      </w:pPr>
-      <w:proofErr w:type="gramStart"/>
-      <w:r>
-        <w:rPr>
-          <w:rFonts w:ascii="Calibri" w:hAnsi="Calibri" w:cs="Calibri"/>
-        </w:rPr>
-        <w:t>File :</w:t>
-      </w:r>
-      <w:proofErr w:type="gramEnd"/>
-      <w:r>
-        <w:rPr>
-          <w:rFonts w:ascii="Calibri" w:hAnsi="Calibri" w:cs="Calibri"/>
-        </w:rPr>
-        <w:t>: resources/data/outbreak-dataset.zip</w:t>
-      </w:r>
-      <w:r>
-        <w:rPr>
-          <w:rFonts w:ascii="Calibri" w:hAnsi="Calibri" w:cs="Calibri"/>
-        </w:rPr>
-        <w:br/>
-      </w:r>
-      <w:proofErr w:type="gramStart"/>
-      <w:r>
-        <w:rPr>
-          <w:rFonts w:ascii="Calibri" w:hAnsi="Calibri" w:cs="Calibri"/>
-        </w:rPr>
-        <w:t>Label :</w:t>
-      </w:r>
-      <w:proofErr w:type="gramEnd"/>
-      <w:r>
-        <w:rPr>
-          <w:rFonts w:ascii="Calibri" w:hAnsi="Calibri" w:cs="Calibri"/>
-        </w:rPr>
-        <w:t>: Download full dataset</w:t>
-      </w:r>
-    </w:p>
-    <w:p>
-      <w:pPr>
-        <w:rPr>
-          <w:rFonts w:ascii="Calibri" w:hAnsi="Calibri" w:cs="Calibri"/>
-        </w:rPr>
-      </w:pPr>
-    </w:p>
-    <w:p>
-      <w:pPr>
-        <w:rPr>
-          <w:rFonts w:ascii="Calibri" w:hAnsi="Calibri" w:cs="Calibri"/>
-        </w:rPr>
-      </w:pPr>
     </w:p>
     <w:p>
       <w:pPr>
@@ -2795,181 +2805,6 @@
         <w:rPr>
           <w:rFonts w:ascii="Calibri" w:hAnsi="Calibri" w:cs="Calibri"/>
         </w:rPr>
-        <w:t>Quiz</w:t>
-      </w:r>
-    </w:p>
-    <w:p>
-      <w:pPr>
-        <w:rPr>
-          <w:rFonts w:ascii="Calibri" w:hAnsi="Calibri" w:cs="Calibri"/>
-        </w:rPr>
-      </w:pPr>
-      <w:r>
-        <w:rPr>
-          <w:rFonts w:ascii="Calibri" w:hAnsi="Calibri" w:cs="Calibri"/>
-        </w:rPr>
-        <w:br/>
-      </w:r>
-      <w:proofErr w:type="gramStart"/>
-      <w:r>
-        <w:rPr>
-          <w:rFonts w:ascii="Calibri" w:hAnsi="Calibri" w:cs="Calibri"/>
-        </w:rPr>
-        <w:t>Question :</w:t>
-      </w:r>
-      <w:proofErr w:type="gramEnd"/>
-      <w:r>
-        <w:rPr>
-          <w:rFonts w:ascii="Calibri" w:hAnsi="Calibri" w:cs="Calibri"/>
-        </w:rPr>
-        <w:t>: Based on the outbreak data, what does a vaccine effectiveness of 80% mean in practice?</w:t>
-      </w:r>
-    </w:p>
-    <w:p>
-      <w:pPr>
-        <w:rPr>
-          <w:rFonts w:ascii="Calibri" w:hAnsi="Calibri" w:cs="Calibri"/>
-        </w:rPr>
-      </w:pPr>
-      <w:proofErr w:type="gramStart"/>
-      <w:r>
-        <w:rPr>
-          <w:rFonts w:ascii="Calibri" w:hAnsi="Calibri" w:cs="Calibri"/>
-        </w:rPr>
-        <w:t>Option :</w:t>
-      </w:r>
-      <w:proofErr w:type="gramEnd"/>
-      <w:r>
-        <w:rPr>
-          <w:rFonts w:ascii="Calibri" w:hAnsi="Calibri" w:cs="Calibri"/>
-        </w:rPr>
-        <w:t>: Vaccinated individuals have zero risk of infection</w:t>
-      </w:r>
-    </w:p>
-    <w:p>
-      <w:pPr>
-        <w:rPr>
-          <w:rFonts w:ascii="Calibri" w:hAnsi="Calibri" w:cs="Calibri"/>
-        </w:rPr>
-      </w:pPr>
-      <w:proofErr w:type="gramStart"/>
-      <w:r>
-        <w:rPr>
-          <w:rFonts w:ascii="Calibri" w:hAnsi="Calibri" w:cs="Calibri"/>
-        </w:rPr>
-        <w:t>Option :</w:t>
-      </w:r>
-      <w:proofErr w:type="gramEnd"/>
-      <w:r>
-        <w:rPr>
-          <w:rFonts w:ascii="Calibri" w:hAnsi="Calibri" w:cs="Calibri"/>
-        </w:rPr>
-        <w:t>: Vaccinated individuals have an 80% lower risk of infection than unvaccinated individuals</w:t>
-      </w:r>
-    </w:p>
-    <w:p>
-      <w:pPr>
-        <w:rPr>
-          <w:rFonts w:ascii="Calibri" w:hAnsi="Calibri" w:cs="Calibri"/>
-        </w:rPr>
-      </w:pPr>
-      <w:proofErr w:type="gramStart"/>
-      <w:r>
-        <w:rPr>
-          <w:rFonts w:ascii="Calibri" w:hAnsi="Calibri" w:cs="Calibri"/>
-        </w:rPr>
-        <w:t>Option :</w:t>
-      </w:r>
-      <w:proofErr w:type="gramEnd"/>
-      <w:r>
-        <w:rPr>
-          <w:rFonts w:ascii="Calibri" w:hAnsi="Calibri" w:cs="Calibri"/>
-        </w:rPr>
-        <w:t>: 80% of vaccinated individuals will not become infected</w:t>
-      </w:r>
-    </w:p>
-    <w:p>
-      <w:pPr>
-        <w:rPr>
-          <w:rFonts w:ascii="Calibri" w:hAnsi="Calibri" w:cs="Calibri"/>
-        </w:rPr>
-      </w:pPr>
-      <w:proofErr w:type="gramStart"/>
-      <w:r>
-        <w:rPr>
-          <w:rFonts w:ascii="Calibri" w:hAnsi="Calibri" w:cs="Calibri"/>
-        </w:rPr>
-        <w:t>Option :</w:t>
-      </w:r>
-      <w:proofErr w:type="gramEnd"/>
-      <w:r>
-        <w:rPr>
-          <w:rFonts w:ascii="Calibri" w:hAnsi="Calibri" w:cs="Calibri"/>
-        </w:rPr>
-        <w:t>: The vaccine prevents 80 cases in every outbreak regardless of context</w:t>
-      </w:r>
-    </w:p>
-    <w:p>
-      <w:pPr>
-        <w:rPr>
-          <w:rFonts w:ascii="Calibri" w:hAnsi="Calibri" w:cs="Calibri"/>
-        </w:rPr>
-      </w:pPr>
-      <w:proofErr w:type="gramStart"/>
-      <w:r>
-        <w:rPr>
-          <w:rFonts w:ascii="Calibri" w:hAnsi="Calibri" w:cs="Calibri"/>
-        </w:rPr>
-        <w:t>Answer :</w:t>
-      </w:r>
-      <w:proofErr w:type="gramEnd"/>
-      <w:r>
-        <w:rPr>
-          <w:rFonts w:ascii="Calibri" w:hAnsi="Calibri" w:cs="Calibri"/>
-        </w:rPr>
-        <w:t>: Vaccinated individuals have an 80% lower risk of infection than unvaccinated individuals</w:t>
-      </w:r>
-    </w:p>
-    <w:p>
-      <w:pPr>
-        <w:rPr>
-          <w:rFonts w:ascii="Calibri" w:hAnsi="Calibri" w:cs="Calibri"/>
-        </w:rPr>
-      </w:pPr>
-      <w:proofErr w:type="gramStart"/>
-      <w:r>
-        <w:rPr>
-          <w:rFonts w:ascii="Calibri" w:hAnsi="Calibri" w:cs="Calibri"/>
-        </w:rPr>
-        <w:t>Explanation :</w:t>
-      </w:r>
-      <w:proofErr w:type="gramEnd"/>
-      <w:r>
-        <w:rPr>
-          <w:rFonts w:ascii="Calibri" w:hAnsi="Calibri" w:cs="Calibri"/>
-        </w:rPr>
-        <w:t>: Vaccine effectiveness compares the risk of disease in vaccinated and unvaccinated groups under real-world conditions. An 80% VE means the vaccinated group experienced substantially lower risk, not that infection risk was eliminated entirely.</w:t>
-      </w:r>
-    </w:p>
-    <w:p>
-      <w:pPr>
-        <w:pStyle w:val="Heading2"/>
-        <w:rPr>
-          <w:rFonts w:ascii="Calibri" w:hAnsi="Calibri" w:cs="Calibri"/>
-        </w:rPr>
-      </w:pPr>
-    </w:p>
-    <w:p>
-      <w:pPr>
-        <w:pStyle w:val="Heading2"/>
-        <w:rPr>
-          <w:rFonts w:ascii="Calibri" w:hAnsi="Calibri" w:cs="Calibri"/>
-        </w:rPr>
-      </w:pPr>
-      <w:r>
-        <w:rPr>
-          <w:rFonts w:ascii="Calibri" w:hAnsi="Calibri" w:cs="Calibri"/>
-        </w:rPr>
         <w:t>Key Takeaway</w:t>
       </w:r>
     </w:p>
@@ -2986,39 +2821,20 @@
           <w:rFonts w:ascii="Calibri" w:hAnsi="Calibri" w:cs="Calibri"/>
         </w:rPr>
       </w:pPr>
-      <w:proofErr w:type="gramStart"/>
-      <w:r>
-        <w:rPr>
-          <w:rFonts w:ascii="Calibri" w:hAnsi="Calibri" w:cs="Calibri"/>
-        </w:rPr>
-        <w:t>Callout :</w:t>
-      </w:r>
-      <w:proofErr w:type="gramEnd"/>
-      <w:r>
-        <w:rPr>
-          <w:rFonts w:ascii="Calibri" w:hAnsi="Calibri" w:cs="Calibri"/>
-        </w:rPr>
-        <w:t>: tip</w:t>
-      </w:r>
-      <w:r>
-        <w:rPr>
-          <w:rFonts w:ascii="Calibri" w:hAnsi="Calibri" w:cs="Calibri"/>
-        </w:rPr>
-        <w:br/>
-      </w:r>
-      <w:proofErr w:type="gramStart"/>
-      <w:r>
-        <w:rPr>
-          <w:rFonts w:ascii="Calibri" w:hAnsi="Calibri" w:cs="Calibri"/>
-        </w:rPr>
-        <w:t>Text :</w:t>
-      </w:r>
-      <w:proofErr w:type="gramEnd"/>
-      <w:r>
-        <w:rPr>
-          <w:rFonts w:ascii="Calibri" w:hAnsi="Calibri" w:cs="Calibri"/>
-        </w:rPr>
-        <w:t>: Vaccination significantly reduces the likelihood of infection and severe disease, even if it does not eliminate risk entirely.</w:t>
+      <w:r>
+        <w:t>Callout :: tip</w:t>
+      </w:r>
+    </w:p>
+    <w:p>
+      <w:pPr/>
+      <w:r>
+        <w:t>Vaccination significantly reduces the likelihood of infection and severe disease, even if it does not eliminate risk entirely.</w:t>
+      </w:r>
+    </w:p>
+    <w:p>
+      <w:pPr/>
+      <w:r>
+        <w:t>END Callout</w:t>
       </w:r>
     </w:p>
     <w:p>
@@ -4337,6 +4153,24 @@
   </w:num>
   <w:num w:numId="6" w16cid:durableId="1720787793">
     <w:abstractNumId w:val="5"/>
+  </w:num>
+  <w:abstractNum w:abstractNumId="6">
+    <w:multiLevelType w:val="singleLevel"/>
+    <w:lvl w:ilvl="0">
+      <w:start w:val="1"/>
+      <w:numFmt w:val="decimal"/>
+      <w:lvlText w:val="%1."/>
+      <w:suff w:val="tab"/>
+      <w:pPr>
+        <w:tabs>
+          <w:tab w:val="num" w:pos="720"/>
+        </w:tabs>
+        <w:ind w:left="720" w:hanging="360"/>
+      </w:pPr>
+    </w:lvl>
+  </w:abstractNum>
+  <w:num w:numId="7">
+    <w:abstractNumId w:val="6"/>
   </w:num>
 </w:numbering>
 </file>

</xml_diff>